<commit_message>
Cierre de pendientes con recomendaciones (D69): sobres del presupuesto, plan de realizacion en G3.05/G4.11, regla de proveedores en 36, perfil F9 y umbral de alfabetizacion, alcance del proveedor de alto riesgo
</commit_message>
<xml_diff>
--- a/SEVEN-G/docx/en/plantillas/P36_SEVEN-G_Plan_de_cartera_C3.docx
+++ b/SEVEN-G/docx/en/plantillas/P36_SEVEN-G_Plan_de_cartera_C3.docx
@@ -1258,7 +1258,205 @@
               <w:pStyle w:val="Celda"/>
             </w:pPr>
             <w:r>
-              <w:t xml:space="preserve">Discovery reserve (tranche 1, phases 0–3)</w:t>
+              <w:t xml:space="preserve">Optimise envelope (tranches 2 and 3)</w:t>
+            </w:r>
+          </w:p>
+        </w:tc>
+        <w:tc>
+          <w:tcPr>
+            <w:tcW w:w="1606" w:type="dxa"/>
+          </w:tcPr>
+          <w:p>
+            <w:pPr>
+              <w:pStyle w:val="Celda"/>
+            </w:pPr>
+          </w:p>
+        </w:tc>
+        <w:tc>
+          <w:tcPr>
+            <w:tcW w:w="1606" w:type="dxa"/>
+          </w:tcPr>
+          <w:p>
+            <w:pPr>
+              <w:pStyle w:val="Celda"/>
+            </w:pPr>
+          </w:p>
+        </w:tc>
+        <w:tc>
+          <w:tcPr>
+            <w:tcW w:w="1606" w:type="dxa"/>
+          </w:tcPr>
+          <w:p>
+            <w:pPr>
+              <w:pStyle w:val="Celda"/>
+            </w:pPr>
+          </w:p>
+        </w:tc>
+        <w:tc>
+          <w:tcPr>
+            <w:tcW w:w="1606" w:type="dxa"/>
+          </w:tcPr>
+          <w:p>
+            <w:pPr>
+              <w:pStyle w:val="Celda"/>
+            </w:pPr>
+          </w:p>
+        </w:tc>
+        <w:tc>
+          <w:tcPr>
+            <w:tcW w:w="1606" w:type="dxa"/>
+          </w:tcPr>
+          <w:p>
+            <w:pPr>
+              <w:pStyle w:val="Celda"/>
+            </w:pPr>
+          </w:p>
+        </w:tc>
+      </w:tr>
+      <w:tr>
+        <w:tc>
+          <w:tcPr>
+            <w:tcW w:w="1606" w:type="dxa"/>
+          </w:tcPr>
+          <w:p>
+            <w:pPr>
+              <w:pStyle w:val="Celda"/>
+            </w:pPr>
+            <w:r>
+              <w:t xml:space="preserve">Augment envelope (tranches 2 and 3, including each initiative's adoption)</w:t>
+            </w:r>
+          </w:p>
+        </w:tc>
+        <w:tc>
+          <w:tcPr>
+            <w:tcW w:w="1606" w:type="dxa"/>
+          </w:tcPr>
+          <w:p>
+            <w:pPr>
+              <w:pStyle w:val="Celda"/>
+            </w:pPr>
+          </w:p>
+        </w:tc>
+        <w:tc>
+          <w:tcPr>
+            <w:tcW w:w="1606" w:type="dxa"/>
+          </w:tcPr>
+          <w:p>
+            <w:pPr>
+              <w:pStyle w:val="Celda"/>
+            </w:pPr>
+          </w:p>
+        </w:tc>
+        <w:tc>
+          <w:tcPr>
+            <w:tcW w:w="1606" w:type="dxa"/>
+          </w:tcPr>
+          <w:p>
+            <w:pPr>
+              <w:pStyle w:val="Celda"/>
+            </w:pPr>
+          </w:p>
+        </w:tc>
+        <w:tc>
+          <w:tcPr>
+            <w:tcW w:w="1606" w:type="dxa"/>
+          </w:tcPr>
+          <w:p>
+            <w:pPr>
+              <w:pStyle w:val="Celda"/>
+            </w:pPr>
+          </w:p>
+        </w:tc>
+        <w:tc>
+          <w:tcPr>
+            <w:tcW w:w="1606" w:type="dxa"/>
+          </w:tcPr>
+          <w:p>
+            <w:pPr>
+              <w:pStyle w:val="Celda"/>
+            </w:pPr>
+          </w:p>
+        </w:tc>
+      </w:tr>
+      <w:tr>
+        <w:tc>
+          <w:tcPr>
+            <w:tcW w:w="1606" w:type="dxa"/>
+          </w:tcPr>
+          <w:p>
+            <w:pPr>
+              <w:pStyle w:val="Celda"/>
+            </w:pPr>
+            <w:r>
+              <w:t xml:space="preserve">Staged Transform envelope</w:t>
+            </w:r>
+          </w:p>
+        </w:tc>
+        <w:tc>
+          <w:tcPr>
+            <w:tcW w:w="1606" w:type="dxa"/>
+          </w:tcPr>
+          <w:p>
+            <w:pPr>
+              <w:pStyle w:val="Celda"/>
+            </w:pPr>
+          </w:p>
+        </w:tc>
+        <w:tc>
+          <w:tcPr>
+            <w:tcW w:w="1606" w:type="dxa"/>
+          </w:tcPr>
+          <w:p>
+            <w:pPr>
+              <w:pStyle w:val="Celda"/>
+            </w:pPr>
+          </w:p>
+        </w:tc>
+        <w:tc>
+          <w:tcPr>
+            <w:tcW w:w="1606" w:type="dxa"/>
+          </w:tcPr>
+          <w:p>
+            <w:pPr>
+              <w:pStyle w:val="Celda"/>
+            </w:pPr>
+          </w:p>
+        </w:tc>
+        <w:tc>
+          <w:tcPr>
+            <w:tcW w:w="1606" w:type="dxa"/>
+          </w:tcPr>
+          <w:p>
+            <w:pPr>
+              <w:pStyle w:val="Celda"/>
+            </w:pPr>
+          </w:p>
+        </w:tc>
+        <w:tc>
+          <w:tcPr>
+            <w:tcW w:w="1606" w:type="dxa"/>
+          </w:tcPr>
+          <w:p>
+            <w:pPr>
+              <w:pStyle w:val="Celda"/>
+            </w:pPr>
+            <w:r>
+              <w:t xml:space="preserve">Only stages approved by the board.</w:t>
+            </w:r>
+          </w:p>
+        </w:tc>
+      </w:tr>
+      <w:tr>
+        <w:tc>
+          <w:tcPr>
+            <w:tcW w:w="1606" w:type="dxa"/>
+          </w:tcPr>
+          <w:p>
+            <w:pPr>
+              <w:pStyle w:val="Celda"/>
+            </w:pPr>
+            <w:r>
+              <w:t xml:space="preserve">Enablement (data, platform, spheres 08 and 09)</w:t>
             </w:r>
           </w:p>
         </w:tc>
@@ -1326,205 +1524,7 @@
               <w:pStyle w:val="Celda"/>
             </w:pPr>
             <w:r>
-              <w:t xml:space="preserve">Optimise envelope (tranches 2 and 3)</w:t>
-            </w:r>
-          </w:p>
-        </w:tc>
-        <w:tc>
-          <w:tcPr>
-            <w:tcW w:w="1606" w:type="dxa"/>
-          </w:tcPr>
-          <w:p>
-            <w:pPr>
-              <w:pStyle w:val="Celda"/>
-            </w:pPr>
-          </w:p>
-        </w:tc>
-        <w:tc>
-          <w:tcPr>
-            <w:tcW w:w="1606" w:type="dxa"/>
-          </w:tcPr>
-          <w:p>
-            <w:pPr>
-              <w:pStyle w:val="Celda"/>
-            </w:pPr>
-          </w:p>
-        </w:tc>
-        <w:tc>
-          <w:tcPr>
-            <w:tcW w:w="1606" w:type="dxa"/>
-          </w:tcPr>
-          <w:p>
-            <w:pPr>
-              <w:pStyle w:val="Celda"/>
-            </w:pPr>
-          </w:p>
-        </w:tc>
-        <w:tc>
-          <w:tcPr>
-            <w:tcW w:w="1606" w:type="dxa"/>
-          </w:tcPr>
-          <w:p>
-            <w:pPr>
-              <w:pStyle w:val="Celda"/>
-            </w:pPr>
-          </w:p>
-        </w:tc>
-        <w:tc>
-          <w:tcPr>
-            <w:tcW w:w="1606" w:type="dxa"/>
-          </w:tcPr>
-          <w:p>
-            <w:pPr>
-              <w:pStyle w:val="Celda"/>
-            </w:pPr>
-          </w:p>
-        </w:tc>
-      </w:tr>
-      <w:tr>
-        <w:tc>
-          <w:tcPr>
-            <w:tcW w:w="1606" w:type="dxa"/>
-          </w:tcPr>
-          <w:p>
-            <w:pPr>
-              <w:pStyle w:val="Celda"/>
-            </w:pPr>
-            <w:r>
-              <w:t xml:space="preserve">Augment envelope (tranches 2 and 3, including adoption)</w:t>
-            </w:r>
-          </w:p>
-        </w:tc>
-        <w:tc>
-          <w:tcPr>
-            <w:tcW w:w="1606" w:type="dxa"/>
-          </w:tcPr>
-          <w:p>
-            <w:pPr>
-              <w:pStyle w:val="Celda"/>
-            </w:pPr>
-          </w:p>
-        </w:tc>
-        <w:tc>
-          <w:tcPr>
-            <w:tcW w:w="1606" w:type="dxa"/>
-          </w:tcPr>
-          <w:p>
-            <w:pPr>
-              <w:pStyle w:val="Celda"/>
-            </w:pPr>
-          </w:p>
-        </w:tc>
-        <w:tc>
-          <w:tcPr>
-            <w:tcW w:w="1606" w:type="dxa"/>
-          </w:tcPr>
-          <w:p>
-            <w:pPr>
-              <w:pStyle w:val="Celda"/>
-            </w:pPr>
-          </w:p>
-        </w:tc>
-        <w:tc>
-          <w:tcPr>
-            <w:tcW w:w="1606" w:type="dxa"/>
-          </w:tcPr>
-          <w:p>
-            <w:pPr>
-              <w:pStyle w:val="Celda"/>
-            </w:pPr>
-          </w:p>
-        </w:tc>
-        <w:tc>
-          <w:tcPr>
-            <w:tcW w:w="1606" w:type="dxa"/>
-          </w:tcPr>
-          <w:p>
-            <w:pPr>
-              <w:pStyle w:val="Celda"/>
-            </w:pPr>
-          </w:p>
-        </w:tc>
-      </w:tr>
-      <w:tr>
-        <w:tc>
-          <w:tcPr>
-            <w:tcW w:w="1606" w:type="dxa"/>
-          </w:tcPr>
-          <w:p>
-            <w:pPr>
-              <w:pStyle w:val="Celda"/>
-            </w:pPr>
-            <w:r>
-              <w:t xml:space="preserve">Staged Transform envelope</w:t>
-            </w:r>
-          </w:p>
-        </w:tc>
-        <w:tc>
-          <w:tcPr>
-            <w:tcW w:w="1606" w:type="dxa"/>
-          </w:tcPr>
-          <w:p>
-            <w:pPr>
-              <w:pStyle w:val="Celda"/>
-            </w:pPr>
-          </w:p>
-        </w:tc>
-        <w:tc>
-          <w:tcPr>
-            <w:tcW w:w="1606" w:type="dxa"/>
-          </w:tcPr>
-          <w:p>
-            <w:pPr>
-              <w:pStyle w:val="Celda"/>
-            </w:pPr>
-          </w:p>
-        </w:tc>
-        <w:tc>
-          <w:tcPr>
-            <w:tcW w:w="1606" w:type="dxa"/>
-          </w:tcPr>
-          <w:p>
-            <w:pPr>
-              <w:pStyle w:val="Celda"/>
-            </w:pPr>
-          </w:p>
-        </w:tc>
-        <w:tc>
-          <w:tcPr>
-            <w:tcW w:w="1606" w:type="dxa"/>
-          </w:tcPr>
-          <w:p>
-            <w:pPr>
-              <w:pStyle w:val="Celda"/>
-            </w:pPr>
-          </w:p>
-        </w:tc>
-        <w:tc>
-          <w:tcPr>
-            <w:tcW w:w="1606" w:type="dxa"/>
-          </w:tcPr>
-          <w:p>
-            <w:pPr>
-              <w:pStyle w:val="Celda"/>
-            </w:pPr>
-            <w:r>
-              <w:t xml:space="preserve">Only stages approved by the board.</w:t>
-            </w:r>
-          </w:p>
-        </w:tc>
-      </w:tr>
-      <w:tr>
-        <w:tc>
-          <w:tcPr>
-            <w:tcW w:w="1606" w:type="dxa"/>
-          </w:tcPr>
-          <w:p>
-            <w:pPr>
-              <w:pStyle w:val="Celda"/>
-            </w:pPr>
-            <w:r>
-              <w:t xml:space="preserve">Enablement (data, platform, spheres 08 and 09)</w:t>
+              <w:t xml:space="preserve">Adoption and training not charged to initiatives</w:t>
             </w:r>
           </w:p>
         </w:tc>
@@ -1592,7 +1592,7 @@
               <w:pStyle w:val="Celda"/>
             </w:pPr>
             <w:r>
-              <w:t xml:space="preserve">Adoption and training not charged to initiatives</w:t>
+              <w:t xml:space="preserve">Contingency</w:t>
             </w:r>
           </w:p>
         </w:tc>
@@ -1647,76 +1647,8 @@
             <w:pPr>
               <w:pStyle w:val="Celda"/>
             </w:pPr>
-          </w:p>
-        </w:tc>
-      </w:tr>
-      <w:tr>
-        <w:tc>
-          <w:tcPr>
-            <w:tcW w:w="1606" w:type="dxa"/>
-          </w:tcPr>
-          <w:p>
-            <w:pPr>
-              <w:pStyle w:val="Celda"/>
-            </w:pPr>
-            <w:r>
-              <w:t xml:space="preserve">Retirement and contingency reserve</w:t>
-            </w:r>
-          </w:p>
-        </w:tc>
-        <w:tc>
-          <w:tcPr>
-            <w:tcW w:w="1606" w:type="dxa"/>
-          </w:tcPr>
-          <w:p>
-            <w:pPr>
-              <w:pStyle w:val="Celda"/>
-            </w:pPr>
-          </w:p>
-        </w:tc>
-        <w:tc>
-          <w:tcPr>
-            <w:tcW w:w="1606" w:type="dxa"/>
-          </w:tcPr>
-          <w:p>
-            <w:pPr>
-              <w:pStyle w:val="Celda"/>
-            </w:pPr>
-          </w:p>
-        </w:tc>
-        <w:tc>
-          <w:tcPr>
-            <w:tcW w:w="1606" w:type="dxa"/>
-          </w:tcPr>
-          <w:p>
-            <w:pPr>
-              <w:pStyle w:val="Celda"/>
-            </w:pPr>
-          </w:p>
-        </w:tc>
-        <w:tc>
-          <w:tcPr>
-            <w:tcW w:w="1606" w:type="dxa"/>
-          </w:tcPr>
-          <w:p>
-            <w:pPr>
-              <w:pStyle w:val="Celda"/>
-            </w:pPr>
-            <w:r>
-              <w:t xml:space="preserve">—</w:t>
-            </w:r>
-          </w:p>
-        </w:tc>
-        <w:tc>
-          <w:tcPr>
-            <w:tcW w:w="1606" w:type="dxa"/>
-          </w:tcPr>
-          <w:p>
-            <w:pPr>
-              <w:pStyle w:val="Celda"/>
-            </w:pPr>
-            <w:r>
-              <w:t xml:space="preserve">Retirements, regularisation and approved deviations.</w:t>
+            <w:r>
+              <w:t xml:space="preserve">Includes the discovery reserve (tranche 1, phases 0–3), the retirement and regularisation reserve and approved deviations (14 §6.1).</w:t>
             </w:r>
           </w:p>
         </w:tc>

</xml_diff>